<commit_message>
Add free Signature Specimen Check with personalised practice sheet
Visitors sign on screen or photograph a signature on paper. The check runs on
their device and measures slant, baseline and proportions (plus pen lifts, time,
pace and stylus pressure when signed on screen). It then creates a specimen
sheet, a share-safe version and a printable A4 practice sheet made from their
own signature, and leads to a free first look on WhatsApp.

- New /tools hub and Free tools nav item; shared tool components and sheet kit
- Watch check refactored onto the shared pieces
- Privacy, analytics events, sitemap and content tests cover both tools
- Ad pack: signature creatives, ad copy, Reel script, playbook funnel, Word docs

Co-Authored-By: Claude Opus 5.5 <noreply@anthropic.com>
Claude-Session: https://claude.ai/code/session_01P21pjse8zHNfbzE8LzweFV
</commit_message>
<xml_diff>
--- a/marketing/instagram-ad-pack/00-word-documents/01 - How to run the ads.docx
+++ b/marketing/instagram-ad-pack/00-word-documents/01 - How to run the ads.docx
@@ -589,6 +589,39 @@
             </w:pPr>
             <w:r>
               <w:t xml:space="preserve">Feed and Story ads for the free Watch Specimen Check, plus an example sheet to post</w:t>
+            </w:r>
+          </w:p>
+        </w:tc>
+      </w:tr>
+      <w:tr>
+        <w:tc>
+          <w:tcPr>
+            <w:tcW w:type="dxa" w:w="2528"/>
+          </w:tcPr>
+          <w:p>
+            <w:pPr>
+              <w:pStyle w:val="Compact"/>
+              <w:jc w:val="left"/>
+            </w:pPr>
+            <w:r>
+              <w:rPr>
+                <w:rStyle w:val="VerbatimChar"/>
+              </w:rPr>
+              <w:t xml:space="preserve">09-free-signature-check/</w:t>
+            </w:r>
+          </w:p>
+        </w:tc>
+        <w:tc>
+          <w:tcPr>
+            <w:tcW w:type="dxa" w:w="7110"/>
+          </w:tcPr>
+          <w:p>
+            <w:pPr>
+              <w:pStyle w:val="Compact"/>
+              <w:jc w:val="left"/>
+            </w:pPr>
+            <w:r>
+              <w:t xml:space="preserve">Feed and Story ads for the free Signature Specimen Check, plus example specimen and practice sheets (“Your Name”) to post</w:t>
             </w:r>
           </w:p>
         </w:tc>

</xml_diff>